<commit_message>
docs: insert all 4 screenshots into Word report (W&B eval, Actions, Docker Hub, W&B train)
</commit_message>
<xml_diff>
--- a/MLOps_GroupProject_Report.docx
+++ b/MLOps_GroupProject_Report.docx
@@ -3649,6 +3649,56 @@
     </w:p>
     <w:p>
       <w:pPr>
+        <w:jc w:val="center"/>
+      </w:pPr>
+      <w:r>
+        <w:drawing>
+          <wp:inline>
+            <wp:extent cx="5486400" cy="2752550"/>
+            <wp:docPr id="3" name="Picture 3"/>
+            <wp:cNvGraphicFramePr>
+              <a:graphicFrameLocks noChangeAspect="1"/>
+            </wp:cNvGraphicFramePr>
+            <a:graphic>
+              <a:graphicData uri="http://schemas.openxmlformats.org/drawingml/2006/picture">
+                <pic:pic>
+                  <pic:nvPicPr>
+                    <pic:cNvPr id="0" name="Screenshot 2026-06-10 at 12.48.52 PM.png"/>
+                    <pic:cNvPicPr/>
+                  </pic:nvPicPr>
+                  <pic:blipFill>
+                    <a:blip r:embed="rId11"/>
+                    <a:stretch>
+                      <a:fillRect/>
+                    </a:stretch>
+                  </pic:blipFill>
+                  <pic:spPr>
+                    <a:xfrm>
+                      <a:off x="0" y="0"/>
+                      <a:ext cx="5486400" cy="2752550"/>
+                    </a:xfrm>
+                    <a:prstGeom prst="rect"/>
+                  </pic:spPr>
+                </pic:pic>
+              </a:graphicData>
+            </a:graphic>
+          </wp:inline>
+        </w:drawing>
+      </w:r>
+    </w:p>
+    <w:p>
+      <w:pPr>
+        <w:jc w:val="center"/>
+      </w:pPr>
+      <w:r>
+        <w:rPr>
+          <w:i/>
+        </w:rPr>
+        <w:t>Figure 3: Docker Hub — Public repository nikhilsainiiitj/mlops-groupproject-inference showing v2 and latest tags (2.9 GB).</w:t>
+      </w:r>
+    </w:p>
+    <w:p>
+      <w:pPr>
         <w:pStyle w:val="FirstParagraph"/>
       </w:pPr>
       <w:r>
@@ -4182,6 +4232,56 @@
       </w:r>
     </w:p>
     <w:p>
+      <w:pPr>
+        <w:jc w:val="center"/>
+      </w:pPr>
+      <w:r>
+        <w:drawing>
+          <wp:inline>
+            <wp:extent cx="5486400" cy="2493484"/>
+            <wp:docPr id="2" name="Picture 2"/>
+            <wp:cNvGraphicFramePr>
+              <a:graphicFrameLocks noChangeAspect="1"/>
+            </wp:cNvGraphicFramePr>
+            <a:graphic>
+              <a:graphicData uri="http://schemas.openxmlformats.org/drawingml/2006/picture">
+                <pic:pic>
+                  <pic:nvPicPr>
+                    <pic:cNvPr id="0" name="Screenshot 2026-06-10 at 12.47.51 PM.png"/>
+                    <pic:cNvPicPr/>
+                  </pic:nvPicPr>
+                  <pic:blipFill>
+                    <a:blip r:embed="rId10"/>
+                    <a:stretch>
+                      <a:fillRect/>
+                    </a:stretch>
+                  </pic:blipFill>
+                  <pic:spPr>
+                    <a:xfrm>
+                      <a:off x="0" y="0"/>
+                      <a:ext cx="5486400" cy="2493484"/>
+                    </a:xfrm>
+                    <a:prstGeom prst="rect"/>
+                  </pic:spPr>
+                </pic:pic>
+              </a:graphicData>
+            </a:graphic>
+          </wp:inline>
+        </w:drawing>
+      </w:r>
+    </w:p>
+    <w:p>
+      <w:pPr>
+        <w:jc w:val="center"/>
+      </w:pPr>
+      <w:r>
+        <w:rPr>
+          <w:i/>
+        </w:rPr>
+        <w:t>Figure 2: GitHub Actions — Successful Inference workflow run (1m 41s) with green checkmark, manually triggered by nikhilsaini-iitj.</w:t>
+      </w:r>
+    </w:p>
+    <w:p>
       <w:r>
         <w:pict>
           <v:rect style="width:0;height:1.5pt" o:hralign="center" o:hrstd="t" o:hr="t"/>
@@ -4515,6 +4615,106 @@
       </w:r>
       <w:r>
         <w:t xml:space="preserve">W&amp;B Workspace with both runs inserted in Section 4.2.1 of this report.</w:t>
+      </w:r>
+    </w:p>
+    <w:p>
+      <w:pPr>
+        <w:jc w:val="center"/>
+      </w:pPr>
+      <w:r>
+        <w:drawing>
+          <wp:inline>
+            <wp:extent cx="5486400" cy="3227018"/>
+            <wp:docPr id="1" name="Picture 1"/>
+            <wp:cNvGraphicFramePr>
+              <a:graphicFrameLocks noChangeAspect="1"/>
+            </wp:cNvGraphicFramePr>
+            <a:graphic>
+              <a:graphicData uri="http://schemas.openxmlformats.org/drawingml/2006/picture">
+                <pic:pic>
+                  <pic:nvPicPr>
+                    <pic:cNvPr id="0" name="Screenshot 2026-06-10 at 12.46.02 PM.png"/>
+                    <pic:cNvPicPr/>
+                  </pic:nvPicPr>
+                  <pic:blipFill>
+                    <a:blip r:embed="rId9"/>
+                    <a:stretch>
+                      <a:fillRect/>
+                    </a:stretch>
+                  </pic:blipFill>
+                  <pic:spPr>
+                    <a:xfrm>
+                      <a:off x="0" y="0"/>
+                      <a:ext cx="5486400" cy="3227018"/>
+                    </a:xfrm>
+                    <a:prstGeom prst="rect"/>
+                  </pic:spPr>
+                </pic:pic>
+              </a:graphicData>
+            </a:graphic>
+          </wp:inline>
+        </w:drawing>
+      </w:r>
+    </w:p>
+    <w:p>
+      <w:pPr>
+        <w:jc w:val="center"/>
+      </w:pPr>
+      <w:r>
+        <w:rPr>
+          <w:i/>
+        </w:rPr>
+        <w:t>Figure 1: W&amp;B Workspace — eval/accuracy and eval/f1 comparison showing run-v1 (MiniLM, red) vs run-v2 (ELECTRA-small, green). v2 outperforms v1 on both metrics.</w:t>
+      </w:r>
+    </w:p>
+    <w:p>
+      <w:pPr>
+        <w:jc w:val="center"/>
+      </w:pPr>
+      <w:r>
+        <w:drawing>
+          <wp:inline>
+            <wp:extent cx="5486400" cy="3231715"/>
+            <wp:docPr id="4" name="Picture 4"/>
+            <wp:cNvGraphicFramePr>
+              <a:graphicFrameLocks noChangeAspect="1"/>
+            </wp:cNvGraphicFramePr>
+            <a:graphic>
+              <a:graphicData uri="http://schemas.openxmlformats.org/drawingml/2006/picture">
+                <pic:pic>
+                  <pic:nvPicPr>
+                    <pic:cNvPr id="0" name="Screenshot 2026-06-10 at 12.46.23 PM.png"/>
+                    <pic:cNvPicPr/>
+                  </pic:nvPicPr>
+                  <pic:blipFill>
+                    <a:blip r:embed="rId12"/>
+                    <a:stretch>
+                      <a:fillRect/>
+                    </a:stretch>
+                  </pic:blipFill>
+                  <pic:spPr>
+                    <a:xfrm>
+                      <a:off x="0" y="0"/>
+                      <a:ext cx="5486400" cy="3231715"/>
+                    </a:xfrm>
+                    <a:prstGeom prst="rect"/>
+                  </pic:spPr>
+                </pic:pic>
+              </a:graphicData>
+            </a:graphic>
+          </wp:inline>
+        </w:drawing>
+      </w:r>
+    </w:p>
+    <w:p>
+      <w:pPr>
+        <w:jc w:val="center"/>
+      </w:pPr>
+      <w:r>
+        <w:rPr>
+          <w:i/>
+        </w:rPr>
+        <w:t>Figure 4: W&amp;B Workspace — Training metrics comparison: train/loss, learning_rate, grad_norm, and epoch progression for both runs.</w:t>
       </w:r>
     </w:p>
     <w:p>

</xml_diff>

<commit_message>
docs: update repo structure in report — planning docs moved to docs/
</commit_message>
<xml_diff>
--- a/MLOps_GroupProject_Report.docx
+++ b/MLOps_GroupProject_Report.docx
@@ -5405,212 +5405,65 @@
       </w:pPr>
       <w:r>
         <w:rPr>
-          <w:rStyle w:val="VerbatimChar"/>
-        </w:rPr>
-        <w:t xml:space="preserve">MLOps_GroupProject/</w:t>
-      </w:r>
-      <w:r>
+          <w:rFonts w:ascii="Courier New" w:hAnsi="Courier New"/>
+        </w:rPr>
+        <w:t>├── README.md              # Setup + all live links</w:t>
         <w:br/>
       </w:r>
-      <w:r>
-        <w:rPr>
-          <w:rStyle w:val="VerbatimChar"/>
-        </w:rPr>
-        <w:t xml:space="preserve">├── .github/workflows/</w:t>
-      </w:r>
-      <w:r>
-        <w:br/>
-      </w:r>
-      <w:r>
-        <w:rPr>
-          <w:rStyle w:val="VerbatimChar"/>
-        </w:rPr>
-        <w:t xml:space="preserve">│   ├── ci.yml              # Lint on develop push / PR to main</w:t>
-      </w:r>
-      <w:r>
-        <w:br/>
-      </w:r>
-      <w:r>
-        <w:rPr>
-          <w:rStyle w:val="VerbatimChar"/>
-        </w:rPr>
-        <w:t xml:space="preserve">│   ├── inference.yml       # Manual inference trigger</w:t>
-      </w:r>
-      <w:r>
-        <w:br/>
-      </w:r>
-      <w:r>
-        <w:rPr>
-          <w:rStyle w:val="VerbatimChar"/>
-        </w:rPr>
-        <w:t xml:space="preserve">│   └── docker.yml          # Auto-build &amp; push on main</w:t>
-      </w:r>
-      <w:r>
-        <w:br/>
-      </w:r>
-      <w:r>
-        <w:rPr>
-          <w:rStyle w:val="VerbatimChar"/>
-        </w:rPr>
-        <w:t xml:space="preserve">├── src/</w:t>
-      </w:r>
-      <w:r>
-        <w:br/>
-      </w:r>
-      <w:r>
-        <w:rPr>
-          <w:rStyle w:val="VerbatimChar"/>
-        </w:rPr>
-        <w:t xml:space="preserve">│   ├── data.py            # Data loading + cleaning</w:t>
-      </w:r>
-      <w:r>
-        <w:br/>
-      </w:r>
-      <w:r>
-        <w:rPr>
-          <w:rStyle w:val="VerbatimChar"/>
-        </w:rPr>
-        <w:t xml:space="preserve">│   ├── train.py           # Local training template</w:t>
-      </w:r>
-      <w:r>
-        <w:br/>
-      </w:r>
-      <w:r>
-        <w:rPr>
-          <w:rStyle w:val="VerbatimChar"/>
-        </w:rPr>
-        <w:t xml:space="preserve">│   ├── eval.py            # Evaluation + artifact logging</w:t>
-      </w:r>
-      <w:r>
-        <w:br/>
-      </w:r>
-      <w:r>
-        <w:rPr>
-          <w:rStyle w:val="VerbatimChar"/>
-        </w:rPr>
-        <w:t xml:space="preserve">│   ├── utils.py           # compute_metrics, TextDataset, load_label_map</w:t>
-      </w:r>
-      <w:r>
-        <w:br/>
-      </w:r>
-      <w:r>
-        <w:rPr>
-          <w:rStyle w:val="VerbatimChar"/>
-        </w:rPr>
-        <w:t xml:space="preserve">│   └── inference.py       # Docker / Actions entrypoint</w:t>
-      </w:r>
-      <w:r>
-        <w:br/>
-      </w:r>
-      <w:r>
-        <w:rPr>
-          <w:rStyle w:val="VerbatimChar"/>
-        </w:rPr>
-        <w:t xml:space="preserve">├── kaggle_minilm.ipynb    # Kaggle notebook v1</w:t>
-      </w:r>
-      <w:r>
-        <w:br/>
-      </w:r>
-      <w:r>
-        <w:rPr>
-          <w:rStyle w:val="VerbatimChar"/>
-        </w:rPr>
-        <w:t xml:space="preserve">├── kaggle_electra.ipynb   # Kaggle notebook v2</w:t>
-      </w:r>
-      <w:r>
-        <w:br/>
-      </w:r>
-      <w:r>
-        <w:rPr>
-          <w:rStyle w:val="VerbatimChar"/>
-        </w:rPr>
-        <w:t xml:space="preserve">├── Dockerfile             # Inference container</w:t>
-      </w:r>
-      <w:r>
-        <w:br/>
-      </w:r>
-      <w:r>
-        <w:rPr>
-          <w:rStyle w:val="VerbatimChar"/>
-        </w:rPr>
-        <w:t xml:space="preserve">├── requirements.txt       # Python dependencies</w:t>
-      </w:r>
-      <w:r>
-        <w:br/>
-      </w:r>
-      <w:r>
-        <w:rPr>
-          <w:rStyle w:val="VerbatimChar"/>
-        </w:rPr>
-        <w:t xml:space="preserve">├── id2label.json          # Label mapping (committed)</w:t>
-      </w:r>
-      <w:r>
-        <w:br/>
-      </w:r>
-      <w:r>
-        <w:rPr>
-          <w:rStyle w:val="VerbatimChar"/>
-        </w:rPr>
-        <w:t xml:space="preserve">├── .gitignore             # Excludes data/, results/, .env</w:t>
-      </w:r>
-      <w:r>
-        <w:br/>
-      </w:r>
-      <w:r>
-        <w:rPr>
-          <w:rStyle w:val="VerbatimChar"/>
-        </w:rPr>
-        <w:t xml:space="preserve">├── README.md              # Setup + all live links</w:t>
-      </w:r>
-      <w:r>
-        <w:br/>
-      </w:r>
-      <w:r>
-        <w:rPr>
-          <w:rStyle w:val="VerbatimChar"/>
-        </w:rPr>
-        <w:t xml:space="preserve">├── TEAM_DECISION.md       # Model-selection voting doc</w:t>
-      </w:r>
-      <w:r>
-        <w:br/>
-      </w:r>
-      <w:r>
-        <w:rPr>
-          <w:rStyle w:val="VerbatimChar"/>
-        </w:rPr>
-        <w:t xml:space="preserve">├── PLAN_v2.md             # Execution plan with role assignments</w:t>
-      </w:r>
-      <w:r>
-        <w:br/>
-      </w:r>
-      <w:r>
-        <w:rPr>
-          <w:rStyle w:val="VerbatimChar"/>
-        </w:rPr>
-        <w:t xml:space="preserve">└── REPORT.md              # This file</w:t>
-      </w:r>
-    </w:p>
-    <w:p>
-      <w:r>
-        <w:pict>
-          <v:rect style="width:0;height:1.5pt" o:hralign="center" o:hrstd="t" o:hr="t"/>
-        </w:pict>
-      </w:r>
-    </w:p>
+    </w:p>
+    <w:p/>
     <w:p>
       <w:pPr>
         <w:pStyle w:val="FirstParagraph"/>
       </w:pPr>
-      <w:r>
-        <w:rPr>
-          <w:i/>
-          <w:iCs/>
-        </w:rPr>
-        <w:t xml:space="preserve">Submitted by Group 2, IIT Jodhpur</w:t>
-      </w:r>
     </w:p>
     <w:bookmarkEnd w:id="42"/>
     <w:bookmarkEnd w:id="43"/>
+    <w:p>
+      <w:r>
+        <w:rPr>
+          <w:rFonts w:ascii="Courier New" w:hAnsi="Courier New"/>
+        </w:rPr>
+        <w:t>├── .gitignore             # Excludes data/, results/, .env</w:t>
+        <w:br/>
+      </w:r>
+    </w:p>
+    <w:p>
+      <w:r>
+        <w:rPr>
+          <w:rFonts w:ascii="Courier New" w:hAnsi="Courier New"/>
+        </w:rPr>
+        <w:t>└── docs/                  # Internal planning docs (not graded)</w:t>
+        <w:br/>
+      </w:r>
+    </w:p>
+    <w:p>
+      <w:r>
+        <w:rPr>
+          <w:rFonts w:ascii="Courier New" w:hAnsi="Courier New"/>
+        </w:rPr>
+        <w:t xml:space="preserve">    ├── TEAM_DECISION.md   # Model-selection voting doc</w:t>
+        <w:br/>
+      </w:r>
+    </w:p>
+    <w:p>
+      <w:r>
+        <w:rPr>
+          <w:rFonts w:ascii="Courier New" w:hAnsi="Courier New"/>
+        </w:rPr>
+        <w:t xml:space="preserve">    ├── PLAN_v2.md         # Execution plan with role assignments</w:t>
+        <w:br/>
+      </w:r>
+    </w:p>
+    <w:p>
+      <w:r>
+        <w:rPr>
+          <w:rFonts w:ascii="Courier New" w:hAnsi="Courier New"/>
+        </w:rPr>
+        <w:t xml:space="preserve">    └── REPORT.md          # This file</w:t>
+        <w:br/>
+      </w:r>
+    </w:p>
     <w:sectPr/>
   </w:body>
 </w:document>

</xml_diff>

<commit_message>
chore: remove internal planning docs from repo — clean for submission
</commit_message>
<xml_diff>
--- a/MLOps_GroupProject_Report.docx
+++ b/MLOps_GroupProject_Report.docx
@@ -5428,33 +5428,9 @@
         <w:br/>
       </w:r>
     </w:p>
-    <w:p>
-      <w:r>
-        <w:rPr>
-          <w:rFonts w:ascii="Courier New" w:hAnsi="Courier New"/>
-        </w:rPr>
-        <w:t>└── docs/                  # Internal planning docs (not graded)</w:t>
-        <w:br/>
-      </w:r>
-    </w:p>
-    <w:p>
-      <w:r>
-        <w:rPr>
-          <w:rFonts w:ascii="Courier New" w:hAnsi="Courier New"/>
-        </w:rPr>
-        <w:t xml:space="preserve">    ├── TEAM_DECISION.md   # Model-selection voting doc</w:t>
-        <w:br/>
-      </w:r>
-    </w:p>
-    <w:p>
-      <w:r>
-        <w:rPr>
-          <w:rFonts w:ascii="Courier New" w:hAnsi="Courier New"/>
-        </w:rPr>
-        <w:t xml:space="preserve">    ├── PLAN_v2.md         # Execution plan with role assignments</w:t>
-        <w:br/>
-      </w:r>
-    </w:p>
+    <w:p/>
+    <w:p/>
+    <w:p/>
     <w:p>
       <w:r>
         <w:rPr>

</xml_diff>